<commit_message>
Fix crew colors: Sound → antique pink, Musician → green; arrow-key nav in schedule grid
- groupColorFor: Sound gets #C38B86 (antique pink), Musician keeps #4E7265 (green)
- ShowForm crew chip dots colored per role via groupColorFor
- Schedule rows: ArrowUp/Down moves between rows, ArrowRight/Left crosses
  columns at cursor boundary

Co-Authored-By: Claude Sonnet 4.6 <noreply@anthropic.com>
</commit_message>
<xml_diff>
--- a/docs/קודים לינקים.docx
+++ b/docs/קודים לינקים.docx
@@ -523,6 +523,251 @@
           <w:t>http://localhost:3001/login</w:t>
         </w:r>
       </w:hyperlink>
+    </w:p>
+    <w:p>
+      <w:pPr>
+        <w:pBdr>
+          <w:top w:val="nil"/>
+          <w:left w:val="nil"/>
+          <w:bottom w:val="nil"/>
+          <w:right w:val="nil"/>
+          <w:between w:val="nil"/>
+        </w:pBdr>
+        <w:spacing w:line="331" w:lineRule="auto"/>
+        <w:rPr>
+          <w:rFonts w:ascii="Google Sans" w:eastAsia="Google Sans" w:hAnsi="Google Sans" w:cs="Google Sans"/>
+          <w:color w:val="000000"/>
+          <w:rtl/>
+          <w:lang w:val="fr-CA"/>
+        </w:rPr>
+      </w:pPr>
+    </w:p>
+    <w:p>
+      <w:pPr>
+        <w:pBdr>
+          <w:top w:val="nil"/>
+          <w:left w:val="nil"/>
+          <w:bottom w:val="nil"/>
+          <w:right w:val="nil"/>
+          <w:between w:val="nil"/>
+        </w:pBdr>
+        <w:spacing w:line="331" w:lineRule="auto"/>
+        <w:rPr>
+          <w:rFonts w:ascii="Google Sans" w:eastAsia="Google Sans" w:hAnsi="Google Sans" w:cs="Google Sans"/>
+          <w:color w:val="000000"/>
+        </w:rPr>
+      </w:pPr>
+      <w:r>
+        <w:rPr>
+          <w:rFonts w:ascii="Google Sans" w:eastAsia="Google Sans" w:hAnsi="Google Sans" w:cs="Google Sans"/>
+          <w:b/>
+          <w:bCs/>
+          <w:color w:val="000000"/>
+        </w:rPr>
+        <w:t>Future-proof</w:t>
+      </w:r>
+      <w:r>
+        <w:rPr>
+          <w:rFonts w:ascii="Google Sans" w:eastAsia="Google Sans" w:hAnsi="Google Sans" w:cs="Google Sans"/>
+          <w:color w:val="000000"/>
+        </w:rPr>
+        <w:t>: scripts/push-google-token.js — if Railway ever loses access again (e.g., after a volume wipe), run:</w:t>
+      </w:r>
+    </w:p>
+    <w:p>
+      <w:pPr>
+        <w:pBdr>
+          <w:top w:val="nil"/>
+          <w:left w:val="nil"/>
+          <w:bottom w:val="nil"/>
+          <w:right w:val="nil"/>
+          <w:between w:val="nil"/>
+        </w:pBdr>
+        <w:spacing w:line="331" w:lineRule="auto"/>
+        <w:rPr>
+          <w:rFonts w:ascii="Google Sans" w:eastAsia="Google Sans" w:hAnsi="Google Sans" w:cs="Google Sans"/>
+          <w:color w:val="000000"/>
+          <w:lang w:val="en-US"/>
+        </w:rPr>
+      </w:pPr>
+      <w:r>
+        <w:rPr>
+          <w:rFonts w:ascii="Google Sans" w:eastAsia="Google Sans" w:hAnsi="Google Sans" w:cs="Google Sans"/>
+          <w:color w:val="000000"/>
+        </w:rPr>
+        <w:t>node scripts/push-google-token.js</w:t>
+      </w:r>
+    </w:p>
+    <w:p>
+      <w:pPr>
+        <w:pBdr>
+          <w:top w:val="nil"/>
+          <w:left w:val="nil"/>
+          <w:bottom w:val="nil"/>
+          <w:right w:val="nil"/>
+          <w:between w:val="nil"/>
+        </w:pBdr>
+        <w:bidi/>
+        <w:spacing w:line="331" w:lineRule="auto"/>
+        <w:rPr>
+          <w:rFonts w:ascii="Google Sans" w:eastAsia="Google Sans" w:hAnsi="Google Sans" w:cs="Google Sans"/>
+          <w:color w:val="000000"/>
+          <w:rtl/>
+          <w:lang w:val="en-US"/>
+        </w:rPr>
+      </w:pPr>
+    </w:p>
+    <w:p>
+      <w:pPr>
+        <w:pBdr>
+          <w:top w:val="nil"/>
+          <w:left w:val="nil"/>
+          <w:bottom w:val="nil"/>
+          <w:right w:val="nil"/>
+          <w:between w:val="nil"/>
+        </w:pBdr>
+        <w:spacing w:line="331" w:lineRule="auto"/>
+        <w:rPr>
+          <w:rFonts w:ascii="Google Sans" w:eastAsia="Google Sans" w:hAnsi="Google Sans" w:cs="Google Sans" w:hint="cs"/>
+          <w:color w:val="000000"/>
+          <w:lang w:val="en-US"/>
+        </w:rPr>
+      </w:pPr>
+      <w:r>
+        <w:rPr>
+          <w:rFonts w:ascii="Google Sans" w:eastAsia="Google Sans" w:hAnsi="Google Sans" w:cs="Google Sans"/>
+          <w:color w:val="000000"/>
+          <w:lang w:val="en-US"/>
+        </w:rPr>
+        <w:t>Railw</w:t>
+      </w:r>
+      <w:r>
+        <w:rPr>
+          <w:rFonts w:ascii="Google Sans" w:eastAsia="Google Sans" w:hAnsi="Google Sans" w:cs="Google Sans"/>
+          <w:color w:val="000000"/>
+          <w:lang w:val="en-US"/>
+        </w:rPr>
+        <w:t>ay update:</w:t>
+      </w:r>
+      <w:r>
+        <w:rPr>
+          <w:rFonts w:ascii="Google Sans" w:eastAsia="Google Sans" w:hAnsi="Google Sans" w:cs="Google Sans"/>
+          <w:color w:val="000000"/>
+          <w:rtl/>
+          <w:lang w:val="en-US"/>
+        </w:rPr>
+        <w:br/>
+      </w:r>
+      <w:r>
+        <w:rPr>
+          <w:rFonts w:ascii="Menlo" w:hAnsi="Menlo" w:cs="Menlo"/>
+          <w:color w:val="000000"/>
+          <w:lang w:val="en-US"/>
+        </w:rPr>
+        <w:t>cd /Users/</w:t>
+      </w:r>
+      <w:proofErr w:type="spellStart"/>
+      <w:r>
+        <w:rPr>
+          <w:rFonts w:ascii="Menlo" w:hAnsi="Menlo" w:cs="Menlo"/>
+          <w:color w:val="000000"/>
+          <w:lang w:val="en-US"/>
+        </w:rPr>
+        <w:t>zlilmargalit</w:t>
+      </w:r>
+      <w:proofErr w:type="spellEnd"/>
+      <w:r>
+        <w:rPr>
+          <w:rFonts w:ascii="Menlo" w:hAnsi="Menlo" w:cs="Menlo"/>
+          <w:color w:val="000000"/>
+          <w:lang w:val="en-US"/>
+        </w:rPr>
+        <w:t>/Desktop/Production-Hub</w:t>
+      </w:r>
+      <w:r>
+        <w:rPr>
+          <w:rFonts w:ascii="Menlo" w:hAnsi="Menlo" w:cs="Menlo"/>
+          <w:color w:val="000000"/>
+          <w:lang w:val="en-US"/>
+        </w:rPr>
+        <w:br/>
+      </w:r>
+      <w:r>
+        <w:rPr>
+          <w:rFonts w:ascii="Google Sans" w:eastAsia="Google Sans" w:hAnsi="Google Sans" w:cs="Google Sans"/>
+          <w:color w:val="000000"/>
+          <w:lang w:val="en-US"/>
+        </w:rPr>
+        <w:t xml:space="preserve">git </w:t>
+      </w:r>
+      <w:proofErr w:type="gramStart"/>
+      <w:r>
+        <w:rPr>
+          <w:rFonts w:ascii="Google Sans" w:eastAsia="Google Sans" w:hAnsi="Google Sans" w:cs="Google Sans"/>
+          <w:color w:val="000000"/>
+          <w:lang w:val="en-US"/>
+        </w:rPr>
+        <w:t>add</w:t>
+      </w:r>
+      <w:r>
+        <w:rPr>
+          <w:rFonts w:ascii="Google Sans" w:eastAsia="Google Sans" w:hAnsi="Google Sans" w:cs="Times New Roman"/>
+          <w:color w:val="000000"/>
+          <w:rtl/>
+          <w:lang w:val="en-US"/>
+        </w:rPr>
+        <w:t xml:space="preserve"> .</w:t>
+      </w:r>
+      <w:proofErr w:type="gramEnd"/>
+      <w:r>
+        <w:rPr>
+          <w:rFonts w:ascii="Google Sans" w:eastAsia="Google Sans" w:hAnsi="Google Sans" w:cs="Times New Roman"/>
+          <w:color w:val="000000"/>
+          <w:lang w:val="en-US"/>
+        </w:rPr>
+        <w:br/>
+      </w:r>
+      <w:r>
+        <w:rPr>
+          <w:rFonts w:ascii="Google Sans" w:eastAsia="Google Sans" w:hAnsi="Google Sans" w:cs="Google Sans"/>
+          <w:color w:val="000000"/>
+          <w:lang w:val="en-US"/>
+        </w:rPr>
+        <w:t>git commit -m "Manual update via terminal</w:t>
+      </w:r>
+      <w:r>
+        <w:rPr>
+          <w:rFonts w:ascii="Google Sans" w:eastAsia="Google Sans" w:hAnsi="Google Sans" w:cs="Times New Roman"/>
+          <w:color w:val="000000"/>
+          <w:rtl/>
+          <w:lang w:val="en-US"/>
+        </w:rPr>
+        <w:t>"</w:t>
+      </w:r>
+      <w:r>
+        <w:rPr>
+          <w:rFonts w:ascii="Google Sans" w:eastAsia="Google Sans" w:hAnsi="Google Sans" w:cs="Times New Roman"/>
+          <w:color w:val="000000"/>
+          <w:lang w:val="en-US"/>
+        </w:rPr>
+        <w:br/>
+      </w:r>
+      <w:r>
+        <w:rPr>
+          <w:rFonts w:ascii="Google Sans" w:eastAsia="Google Sans" w:hAnsi="Google Sans" w:cs="Times New Roman"/>
+          <w:color w:val="000000"/>
+          <w:lang w:val="en-US"/>
+        </w:rPr>
+        <w:t>git push origin main</w:t>
+      </w:r>
+      <w:r>
+        <w:rPr>
+          <w:rFonts w:ascii="Google Sans" w:eastAsia="Google Sans" w:hAnsi="Google Sans" w:cs="Times New Roman"/>
+          <w:color w:val="000000"/>
+          <w:lang w:val="en-US"/>
+        </w:rPr>
+        <w:br/>
+      </w:r>
     </w:p>
     <w:p>
       <w:pPr>
@@ -1108,7 +1353,6 @@
   <w:style w:type="character" w:default="1" w:styleId="DefaultParagraphFont">
     <w:name w:val="Default Paragraph Font"/>
     <w:uiPriority w:val="1"/>
-    <w:semiHidden/>
     <w:unhideWhenUsed/>
   </w:style>
   <w:style w:type="table" w:default="1" w:styleId="TableNormal">

</xml_diff>